<commit_message>
Reversed throttle / brake to match actual cab location
</commit_message>
<xml_diff>
--- a/profiles/documentation/tsw_class_313_dtg_thejag.docx
+++ b/profiles/documentation/tsw_class_313_dtg_thejag.docx
@@ -569,7 +569,169 @@
               <mc:AlternateContent>
                 <mc:Choice Requires="wps">
                   <w:drawing>
-                    <wp:anchor distT="0" distB="0" distL="114300" distR="114300" simplePos="0" relativeHeight="251777024" behindDoc="0" locked="0" layoutInCell="1" allowOverlap="1" wp14:anchorId="66F7DC31" wp14:editId="1AFEC23C">
+                    <wp:anchor distT="0" distB="0" distL="114300" distR="114300" simplePos="0" relativeHeight="251774976" behindDoc="0" locked="0" layoutInCell="1" allowOverlap="1" wp14:anchorId="47E916C9" wp14:editId="36E9CED3">
+                      <wp:simplePos x="0" y="0"/>
+                      <wp:positionH relativeFrom="column">
+                        <wp:posOffset>2751811</wp:posOffset>
+                      </wp:positionH>
+                      <wp:positionV relativeFrom="paragraph">
+                        <wp:posOffset>3068320</wp:posOffset>
+                      </wp:positionV>
+                      <wp:extent cx="95250" cy="95250"/>
+                      <wp:effectExtent l="0" t="0" r="19050" b="19050"/>
+                      <wp:wrapNone/>
+                      <wp:docPr id="250871466" name="Oval 1"/>
+                      <wp:cNvGraphicFramePr/>
+                      <a:graphic xmlns:a="http://schemas.openxmlformats.org/drawingml/2006/main">
+                        <a:graphicData uri="http://schemas.microsoft.com/office/word/2010/wordprocessingShape">
+                          <wps:wsp>
+                            <wps:cNvSpPr/>
+                            <wps:spPr>
+                              <a:xfrm>
+                                <a:off x="0" y="0"/>
+                                <a:ext cx="95250" cy="95250"/>
+                              </a:xfrm>
+                              <a:prstGeom prst="ellipse">
+                                <a:avLst/>
+                              </a:prstGeom>
+                              <a:solidFill>
+                                <a:srgbClr val="00B050"/>
+                              </a:solidFill>
+                              <a:ln w="9525">
+                                <a:solidFill>
+                                  <a:schemeClr val="bg1"/>
+                                </a:solidFill>
+                              </a:ln>
+                            </wps:spPr>
+                            <wps:style>
+                              <a:lnRef idx="2">
+                                <a:schemeClr val="accent6">
+                                  <a:shade val="15000"/>
+                                </a:schemeClr>
+                              </a:lnRef>
+                              <a:fillRef idx="1">
+                                <a:schemeClr val="accent6"/>
+                              </a:fillRef>
+                              <a:effectRef idx="0">
+                                <a:schemeClr val="accent6"/>
+                              </a:effectRef>
+                              <a:fontRef idx="minor">
+                                <a:schemeClr val="lt1"/>
+                              </a:fontRef>
+                            </wps:style>
+                            <wps:bodyPr rot="0" spcFirstLastPara="0" vertOverflow="overflow" horzOverflow="overflow" vert="horz" wrap="square" lIns="91440" tIns="45720" rIns="91440" bIns="45720" numCol="1" spcCol="0" rtlCol="0" fromWordArt="0" anchor="ctr" anchorCtr="0" forceAA="0" compatLnSpc="1">
+                              <a:prstTxWarp prst="textNoShape">
+                                <a:avLst/>
+                              </a:prstTxWarp>
+                              <a:noAutofit/>
+                            </wps:bodyPr>
+                          </wps:wsp>
+                        </a:graphicData>
+                      </a:graphic>
+                    </wp:anchor>
+                  </w:drawing>
+                </mc:Choice>
+                <mc:Fallback>
+                  <w:pict>
+                    <v:oval w14:anchorId="79B7CE14" id="Oval 1" o:spid="_x0000_s1026" style="position:absolute;margin-left:216.7pt;margin-top:241.6pt;width:7.5pt;height:7.5pt;z-index:251774976;visibility:visible;mso-wrap-style:square;mso-wrap-distance-left:9pt;mso-wrap-distance-top:0;mso-wrap-distance-right:9pt;mso-wrap-distance-bottom:0;mso-position-horizontal:absolute;mso-position-horizontal-relative:text;mso-position-vertical:absolute;mso-position-vertical-relative:text;v-text-anchor:middle" o:gfxdata="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" fillcolor="#00b050" strokecolor="white [3212]">
+                      <v:stroke joinstyle="miter"/>
+                    </v:oval>
+                  </w:pict>
+                </mc:Fallback>
+              </mc:AlternateContent>
+            </w:r>
+            <w:r>
+              <w:rPr>
+                <w:noProof/>
+                <w:color w:val="FFFFFF" w:themeColor="background1"/>
+                <w:sz w:val="32"/>
+                <w:szCs w:val="32"/>
+              </w:rPr>
+              <mc:AlternateContent>
+                <mc:Choice Requires="wps">
+                  <w:drawing>
+                    <wp:anchor distT="0" distB="0" distL="114300" distR="114300" simplePos="0" relativeHeight="251704320" behindDoc="0" locked="0" layoutInCell="1" allowOverlap="1" wp14:anchorId="3BA97E6A" wp14:editId="5DCF6AD2">
+                      <wp:simplePos x="0" y="0"/>
+                      <wp:positionH relativeFrom="column">
+                        <wp:posOffset>3776701</wp:posOffset>
+                      </wp:positionH>
+                      <wp:positionV relativeFrom="paragraph">
+                        <wp:posOffset>708660</wp:posOffset>
+                      </wp:positionV>
+                      <wp:extent cx="95250" cy="95250"/>
+                      <wp:effectExtent l="0" t="0" r="19050" b="19050"/>
+                      <wp:wrapNone/>
+                      <wp:docPr id="1821372240" name="Oval 1"/>
+                      <wp:cNvGraphicFramePr/>
+                      <a:graphic xmlns:a="http://schemas.openxmlformats.org/drawingml/2006/main">
+                        <a:graphicData uri="http://schemas.microsoft.com/office/word/2010/wordprocessingShape">
+                          <wps:wsp>
+                            <wps:cNvSpPr/>
+                            <wps:spPr>
+                              <a:xfrm>
+                                <a:off x="0" y="0"/>
+                                <a:ext cx="95250" cy="95250"/>
+                              </a:xfrm>
+                              <a:prstGeom prst="ellipse">
+                                <a:avLst/>
+                              </a:prstGeom>
+                              <a:solidFill>
+                                <a:srgbClr val="00B050"/>
+                              </a:solidFill>
+                              <a:ln w="9525">
+                                <a:solidFill>
+                                  <a:schemeClr val="bg1"/>
+                                </a:solidFill>
+                              </a:ln>
+                            </wps:spPr>
+                            <wps:style>
+                              <a:lnRef idx="2">
+                                <a:schemeClr val="accent6">
+                                  <a:shade val="15000"/>
+                                </a:schemeClr>
+                              </a:lnRef>
+                              <a:fillRef idx="1">
+                                <a:schemeClr val="accent6"/>
+                              </a:fillRef>
+                              <a:effectRef idx="0">
+                                <a:schemeClr val="accent6"/>
+                              </a:effectRef>
+                              <a:fontRef idx="minor">
+                                <a:schemeClr val="lt1"/>
+                              </a:fontRef>
+                            </wps:style>
+                            <wps:bodyPr rot="0" spcFirstLastPara="0" vertOverflow="overflow" horzOverflow="overflow" vert="horz" wrap="square" lIns="91440" tIns="45720" rIns="91440" bIns="45720" numCol="1" spcCol="0" rtlCol="0" fromWordArt="0" anchor="ctr" anchorCtr="0" forceAA="0" compatLnSpc="1">
+                              <a:prstTxWarp prst="textNoShape">
+                                <a:avLst/>
+                              </a:prstTxWarp>
+                              <a:noAutofit/>
+                            </wps:bodyPr>
+                          </wps:wsp>
+                        </a:graphicData>
+                      </a:graphic>
+                    </wp:anchor>
+                  </w:drawing>
+                </mc:Choice>
+                <mc:Fallback>
+                  <w:pict>
+                    <v:oval w14:anchorId="7F617AF4" id="Oval 1" o:spid="_x0000_s1026" style="position:absolute;margin-left:297.4pt;margin-top:55.8pt;width:7.5pt;height:7.5pt;z-index:251704320;visibility:visible;mso-wrap-style:square;mso-wrap-distance-left:9pt;mso-wrap-distance-top:0;mso-wrap-distance-right:9pt;mso-wrap-distance-bottom:0;mso-position-horizontal:absolute;mso-position-horizontal-relative:text;mso-position-vertical:absolute;mso-position-vertical-relative:text;v-text-anchor:middle" o:gfxdata="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" fillcolor="#00b050" strokecolor="white [3212]">
+                      <v:stroke joinstyle="miter"/>
+                    </v:oval>
+                  </w:pict>
+                </mc:Fallback>
+              </mc:AlternateContent>
+            </w:r>
+            <w:r>
+              <w:rPr>
+                <w:noProof/>
+                <w:color w:val="FFFFFF" w:themeColor="background1"/>
+                <w:sz w:val="32"/>
+                <w:szCs w:val="32"/>
+              </w:rPr>
+              <mc:AlternateContent>
+                <mc:Choice Requires="wps">
+                  <w:drawing>
+                    <wp:anchor distT="0" distB="0" distL="114300" distR="114300" simplePos="0" relativeHeight="251777024" behindDoc="0" locked="0" layoutInCell="1" allowOverlap="1" wp14:anchorId="66F7DC31" wp14:editId="273F6DF0">
                       <wp:simplePos x="0" y="0"/>
                       <wp:positionH relativeFrom="column">
                         <wp:posOffset>3560089</wp:posOffset>
@@ -653,22 +815,7 @@
                                         </w14:srgbClr>
                                       </w14:shadow>
                                     </w:rPr>
-                                    <w:t>DSD</w:t>
-                                  </w:r>
-                                  <w:r>
-                                    <w:rPr>
-                                      <w:b/>
-                                      <w:bCs/>
-                                      <w:color w:val="FF0000"/>
-                                      <w:sz w:val="20"/>
-                                      <w:szCs w:val="20"/>
-                                      <w14:shadow w14:blurRad="50800" w14:dist="38100" w14:dir="2700000" w14:sx="100000" w14:sy="100000" w14:kx="0" w14:ky="0" w14:algn="tl">
-                                        <w14:srgbClr w14:val="000000">
-                                          <w14:alpha w14:val="60000"/>
-                                        </w14:srgbClr>
-                                      </w14:shadow>
-                                    </w:rPr>
-                                    <w:t xml:space="preserve"> </w:t>
+                                    <w:t xml:space="preserve">DSD </w:t>
                                   </w:r>
                                   <w:r>
                                     <w:rPr>
@@ -743,22 +890,7 @@
                                   </w14:srgbClr>
                                 </w14:shadow>
                               </w:rPr>
-                              <w:t>DSD</w:t>
-                            </w:r>
-                            <w:r>
-                              <w:rPr>
-                                <w:b/>
-                                <w:bCs/>
-                                <w:color w:val="FF0000"/>
-                                <w:sz w:val="20"/>
-                                <w:szCs w:val="20"/>
-                                <w14:shadow w14:blurRad="50800" w14:dist="38100" w14:dir="2700000" w14:sx="100000" w14:sy="100000" w14:kx="0" w14:ky="0" w14:algn="tl">
-                                  <w14:srgbClr w14:val="000000">
-                                    <w14:alpha w14:val="60000"/>
-                                  </w14:srgbClr>
-                                </w14:shadow>
-                              </w:rPr>
-                              <w:t xml:space="preserve"> </w:t>
+                              <w:t xml:space="preserve">DSD </w:t>
                             </w:r>
                             <w:r>
                               <w:rPr>
@@ -794,87 +926,6 @@
               <mc:AlternateContent>
                 <mc:Choice Requires="wps">
                   <w:drawing>
-                    <wp:anchor distT="0" distB="0" distL="114300" distR="114300" simplePos="0" relativeHeight="251774976" behindDoc="0" locked="0" layoutInCell="1" allowOverlap="1" wp14:anchorId="47E916C9" wp14:editId="69837CA7">
-                      <wp:simplePos x="0" y="0"/>
-                      <wp:positionH relativeFrom="column">
-                        <wp:posOffset>3758286</wp:posOffset>
-                      </wp:positionH>
-                      <wp:positionV relativeFrom="paragraph">
-                        <wp:posOffset>3068320</wp:posOffset>
-                      </wp:positionV>
-                      <wp:extent cx="95250" cy="95250"/>
-                      <wp:effectExtent l="0" t="0" r="19050" b="19050"/>
-                      <wp:wrapNone/>
-                      <wp:docPr id="250871466" name="Oval 1"/>
-                      <wp:cNvGraphicFramePr/>
-                      <a:graphic xmlns:a="http://schemas.openxmlformats.org/drawingml/2006/main">
-                        <a:graphicData uri="http://schemas.microsoft.com/office/word/2010/wordprocessingShape">
-                          <wps:wsp>
-                            <wps:cNvSpPr/>
-                            <wps:spPr>
-                              <a:xfrm>
-                                <a:off x="0" y="0"/>
-                                <a:ext cx="95250" cy="95250"/>
-                              </a:xfrm>
-                              <a:prstGeom prst="ellipse">
-                                <a:avLst/>
-                              </a:prstGeom>
-                              <a:solidFill>
-                                <a:srgbClr val="00B050"/>
-                              </a:solidFill>
-                              <a:ln w="9525">
-                                <a:solidFill>
-                                  <a:schemeClr val="bg1"/>
-                                </a:solidFill>
-                              </a:ln>
-                            </wps:spPr>
-                            <wps:style>
-                              <a:lnRef idx="2">
-                                <a:schemeClr val="accent6">
-                                  <a:shade val="15000"/>
-                                </a:schemeClr>
-                              </a:lnRef>
-                              <a:fillRef idx="1">
-                                <a:schemeClr val="accent6"/>
-                              </a:fillRef>
-                              <a:effectRef idx="0">
-                                <a:schemeClr val="accent6"/>
-                              </a:effectRef>
-                              <a:fontRef idx="minor">
-                                <a:schemeClr val="lt1"/>
-                              </a:fontRef>
-                            </wps:style>
-                            <wps:bodyPr rot="0" spcFirstLastPara="0" vertOverflow="overflow" horzOverflow="overflow" vert="horz" wrap="square" lIns="91440" tIns="45720" rIns="91440" bIns="45720" numCol="1" spcCol="0" rtlCol="0" fromWordArt="0" anchor="ctr" anchorCtr="0" forceAA="0" compatLnSpc="1">
-                              <a:prstTxWarp prst="textNoShape">
-                                <a:avLst/>
-                              </a:prstTxWarp>
-                              <a:noAutofit/>
-                            </wps:bodyPr>
-                          </wps:wsp>
-                        </a:graphicData>
-                      </a:graphic>
-                    </wp:anchor>
-                  </w:drawing>
-                </mc:Choice>
-                <mc:Fallback>
-                  <w:pict>
-                    <v:oval w14:anchorId="61C309FD" id="Oval 1" o:spid="_x0000_s1026" style="position:absolute;margin-left:295.95pt;margin-top:241.6pt;width:7.5pt;height:7.5pt;z-index:251774976;visibility:visible;mso-wrap-style:square;mso-wrap-distance-left:9pt;mso-wrap-distance-top:0;mso-wrap-distance-right:9pt;mso-wrap-distance-bottom:0;mso-position-horizontal:absolute;mso-position-horizontal-relative:text;mso-position-vertical:absolute;mso-position-vertical-relative:text;v-text-anchor:middle" o:gfxdata="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" fillcolor="#00b050" strokecolor="white [3212]">
-                      <v:stroke joinstyle="miter"/>
-                    </v:oval>
-                  </w:pict>
-                </mc:Fallback>
-              </mc:AlternateContent>
-            </w:r>
-            <w:r>
-              <w:rPr>
-                <w:noProof/>
-                <w:color w:val="FFFFFF" w:themeColor="background1"/>
-                <w:sz w:val="32"/>
-                <w:szCs w:val="32"/>
-              </w:rPr>
-              <mc:AlternateContent>
-                <mc:Choice Requires="wps">
-                  <w:drawing>
                     <wp:anchor distT="0" distB="0" distL="114300" distR="114300" simplePos="0" relativeHeight="251772928" behindDoc="0" locked="0" layoutInCell="1" allowOverlap="1" wp14:anchorId="5783F337" wp14:editId="26117E0C">
                       <wp:simplePos x="0" y="0"/>
                       <wp:positionH relativeFrom="column">
@@ -887,6 +938,173 @@
                       <wp:effectExtent l="0" t="0" r="17145" b="12700"/>
                       <wp:wrapNone/>
                       <wp:docPr id="1995518979" name="Rectangle 1"/>
+                      <wp:cNvGraphicFramePr/>
+                      <a:graphic xmlns:a="http://schemas.openxmlformats.org/drawingml/2006/main">
+                        <a:graphicData uri="http://schemas.microsoft.com/office/word/2010/wordprocessingShape">
+                          <wps:wsp>
+                            <wps:cNvSpPr/>
+                            <wps:spPr>
+                              <a:xfrm>
+                                <a:off x="0" y="0"/>
+                                <a:ext cx="611505" cy="215900"/>
+                              </a:xfrm>
+                              <a:prstGeom prst="rect">
+                                <a:avLst/>
+                              </a:prstGeom>
+                              <a:solidFill>
+                                <a:srgbClr val="000000">
+                                  <a:alpha val="60000"/>
+                                </a:srgbClr>
+                              </a:solidFill>
+                              <a:ln w="12700">
+                                <a:solidFill>
+                                  <a:srgbClr val="FF0000"/>
+                                </a:solidFill>
+                              </a:ln>
+                            </wps:spPr>
+                            <wps:style>
+                              <a:lnRef idx="2">
+                                <a:schemeClr val="accent1">
+                                  <a:shade val="15000"/>
+                                </a:schemeClr>
+                              </a:lnRef>
+                              <a:fillRef idx="1">
+                                <a:schemeClr val="accent1"/>
+                              </a:fillRef>
+                              <a:effectRef idx="0">
+                                <a:schemeClr val="accent1"/>
+                              </a:effectRef>
+                              <a:fontRef idx="minor">
+                                <a:schemeClr val="lt1"/>
+                              </a:fontRef>
+                            </wps:style>
+                            <wps:txbx>
+                              <w:txbxContent>
+                                <w:p>
+                                  <w:pPr>
+                                    <w:spacing w:after="0"/>
+                                    <w:jc w:val="center"/>
+                                    <w:rPr>
+                                      <w:b/>
+                                      <w:bCs/>
+                                      <w:color w:val="FF0000"/>
+                                      <w:sz w:val="20"/>
+                                      <w:szCs w:val="20"/>
+                                      <w:lang w:val="en-GB"/>
+                                      <w14:shadow w14:blurRad="50800" w14:dist="38100" w14:dir="2700000" w14:sx="100000" w14:sy="100000" w14:kx="0" w14:ky="0" w14:algn="tl">
+                                        <w14:srgbClr w14:val="000000">
+                                          <w14:alpha w14:val="60000"/>
+                                        </w14:srgbClr>
+                                      </w14:shadow>
+                                    </w:rPr>
+                                  </w:pPr>
+                                  <w:r>
+                                    <w:rPr>
+                                      <w:b/>
+                                      <w:bCs/>
+                                      <w:color w:val="FF0000"/>
+                                      <w:sz w:val="20"/>
+                                      <w:szCs w:val="20"/>
+                                      <w:lang w:val="en-GB"/>
+                                      <w14:shadow w14:blurRad="50800" w14:dist="38100" w14:dir="2700000" w14:sx="100000" w14:sy="100000" w14:kx="0" w14:ky="0" w14:algn="tl">
+                                        <w14:srgbClr w14:val="000000">
+                                          <w14:alpha w14:val="60000"/>
+                                        </w14:srgbClr>
+                                      </w14:shadow>
+                                    </w:rPr>
+                                    <w:t>Throttle</w:t>
+                                  </w:r>
+                                </w:p>
+                              </w:txbxContent>
+                            </wps:txbx>
+                            <wps:bodyPr rot="0" spcFirstLastPara="0" vertOverflow="overflow" horzOverflow="overflow" vert="horz" wrap="square" lIns="0" tIns="0" rIns="0" bIns="0" numCol="1" spcCol="0" rtlCol="0" fromWordArt="0" anchor="ctr" anchorCtr="0" forceAA="0" compatLnSpc="1">
+                              <a:prstTxWarp prst="textNoShape">
+                                <a:avLst/>
+                              </a:prstTxWarp>
+                              <a:noAutofit/>
+                            </wps:bodyPr>
+                          </wps:wsp>
+                        </a:graphicData>
+                      </a:graphic>
+                      <wp14:sizeRelH relativeFrom="margin">
+                        <wp14:pctWidth>0</wp14:pctWidth>
+                      </wp14:sizeRelH>
+                      <wp14:sizeRelV relativeFrom="margin">
+                        <wp14:pctHeight>0</wp14:pctHeight>
+                      </wp14:sizeRelV>
+                    </wp:anchor>
+                  </w:drawing>
+                </mc:Choice>
+                <mc:Fallback>
+                  <w:pict>
+                    <v:rect w14:anchorId="5783F337" id="_x0000_s1027" style="position:absolute;left:0;text-align:left;margin-left:280.15pt;margin-top:135.5pt;width:48.15pt;height:17pt;z-index:251772928;visibility:visible;mso-wrap-style:square;mso-width-percent:0;mso-height-percent:0;mso-wrap-distance-left:9pt;mso-wrap-distance-top:0;mso-wrap-distance-right:9pt;mso-wrap-distance-bottom:0;mso-position-horizontal:absolute;mso-position-horizontal-relative:text;mso-position-vertical:absolute;mso-position-vertical-relative:text;mso-width-percent:0;mso-height-percent:0;mso-width-relative:margin;mso-height-relative:margin;v-text-anchor:middle" o:gfxdata="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" fillcolor="black" strokecolor="red" strokeweight="1pt">
+                      <v:fill opacity="39321f"/>
+                      <v:textbox inset="0,0,0,0">
+                        <w:txbxContent>
+                          <w:p>
+                            <w:pPr>
+                              <w:spacing w:after="0"/>
+                              <w:jc w:val="center"/>
+                              <w:rPr>
+                                <w:b/>
+                                <w:bCs/>
+                                <w:color w:val="FF0000"/>
+                                <w:sz w:val="20"/>
+                                <w:szCs w:val="20"/>
+                                <w:lang w:val="en-GB"/>
+                                <w14:shadow w14:blurRad="50800" w14:dist="38100" w14:dir="2700000" w14:sx="100000" w14:sy="100000" w14:kx="0" w14:ky="0" w14:algn="tl">
+                                  <w14:srgbClr w14:val="000000">
+                                    <w14:alpha w14:val="60000"/>
+                                  </w14:srgbClr>
+                                </w14:shadow>
+                              </w:rPr>
+                            </w:pPr>
+                            <w:r>
+                              <w:rPr>
+                                <w:b/>
+                                <w:bCs/>
+                                <w:color w:val="FF0000"/>
+                                <w:sz w:val="20"/>
+                                <w:szCs w:val="20"/>
+                                <w:lang w:val="en-GB"/>
+                                <w14:shadow w14:blurRad="50800" w14:dist="38100" w14:dir="2700000" w14:sx="100000" w14:sy="100000" w14:kx="0" w14:ky="0" w14:algn="tl">
+                                  <w14:srgbClr w14:val="000000">
+                                    <w14:alpha w14:val="60000"/>
+                                  </w14:srgbClr>
+                                </w14:shadow>
+                              </w:rPr>
+                              <w:t>Throttle</w:t>
+                            </w:r>
+                          </w:p>
+                        </w:txbxContent>
+                      </v:textbox>
+                    </v:rect>
+                  </w:pict>
+                </mc:Fallback>
+              </mc:AlternateContent>
+            </w:r>
+            <w:r>
+              <w:rPr>
+                <w:noProof/>
+                <w:color w:val="FFFFFF" w:themeColor="background1"/>
+                <w:sz w:val="32"/>
+                <w:szCs w:val="32"/>
+              </w:rPr>
+              <mc:AlternateContent>
+                <mc:Choice Requires="wps">
+                  <w:drawing>
+                    <wp:anchor distT="0" distB="0" distL="114300" distR="114300" simplePos="0" relativeHeight="251770880" behindDoc="0" locked="0" layoutInCell="1" allowOverlap="1" wp14:anchorId="34F05FDF" wp14:editId="4452B240">
+                      <wp:simplePos x="0" y="0"/>
+                      <wp:positionH relativeFrom="column">
+                        <wp:posOffset>2525751</wp:posOffset>
+                      </wp:positionH>
+                      <wp:positionV relativeFrom="paragraph">
+                        <wp:posOffset>1720850</wp:posOffset>
+                      </wp:positionV>
+                      <wp:extent cx="611505" cy="215900"/>
+                      <wp:effectExtent l="0" t="0" r="17145" b="12700"/>
+                      <wp:wrapNone/>
+                      <wp:docPr id="619711364" name="Rectangle 1"/>
                       <wp:cNvGraphicFramePr/>
                       <a:graphic xmlns:a="http://schemas.openxmlformats.org/drawingml/2006/main">
                         <a:graphicData uri="http://schemas.microsoft.com/office/word/2010/wordprocessingShape">
@@ -986,7 +1204,7 @@
                 </mc:Choice>
                 <mc:Fallback>
                   <w:pict>
-                    <v:rect w14:anchorId="5783F337" id="_x0000_s1027" style="position:absolute;left:0;text-align:left;margin-left:280.15pt;margin-top:135.5pt;width:48.15pt;height:17pt;z-index:251772928;visibility:visible;mso-wrap-style:square;mso-width-percent:0;mso-height-percent:0;mso-wrap-distance-left:9pt;mso-wrap-distance-top:0;mso-wrap-distance-right:9pt;mso-wrap-distance-bottom:0;mso-position-horizontal:absolute;mso-position-horizontal-relative:text;mso-position-vertical:absolute;mso-position-vertical-relative:text;mso-width-percent:0;mso-height-percent:0;mso-width-relative:margin;mso-height-relative:margin;v-text-anchor:middle" o:gfxdata="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" fillcolor="black" strokecolor="red" strokeweight="1pt">
+                    <v:rect w14:anchorId="34F05FDF" id="_x0000_s1028" style="position:absolute;left:0;text-align:left;margin-left:198.9pt;margin-top:135.5pt;width:48.15pt;height:17pt;z-index:251770880;visibility:visible;mso-wrap-style:square;mso-width-percent:0;mso-height-percent:0;mso-wrap-distance-left:9pt;mso-wrap-distance-top:0;mso-wrap-distance-right:9pt;mso-wrap-distance-bottom:0;mso-position-horizontal:absolute;mso-position-horizontal-relative:text;mso-position-vertical:absolute;mso-position-vertical-relative:text;mso-width-percent:0;mso-height-percent:0;mso-width-relative:margin;mso-height-relative:margin;v-text-anchor:middle" o:gfxdata="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" fillcolor="black" strokecolor="red" strokeweight="1pt">
                       <v:fill opacity="39321f"/>
                       <v:textbox inset="0,0,0,0">
                         <w:txbxContent>
@@ -1023,173 +1241,6 @@
                                 </w14:shadow>
                               </w:rPr>
                               <w:t>Brake</w:t>
-                            </w:r>
-                          </w:p>
-                        </w:txbxContent>
-                      </v:textbox>
-                    </v:rect>
-                  </w:pict>
-                </mc:Fallback>
-              </mc:AlternateContent>
-            </w:r>
-            <w:r>
-              <w:rPr>
-                <w:noProof/>
-                <w:color w:val="FFFFFF" w:themeColor="background1"/>
-                <w:sz w:val="32"/>
-                <w:szCs w:val="32"/>
-              </w:rPr>
-              <mc:AlternateContent>
-                <mc:Choice Requires="wps">
-                  <w:drawing>
-                    <wp:anchor distT="0" distB="0" distL="114300" distR="114300" simplePos="0" relativeHeight="251770880" behindDoc="0" locked="0" layoutInCell="1" allowOverlap="1" wp14:anchorId="34F05FDF" wp14:editId="4452B240">
-                      <wp:simplePos x="0" y="0"/>
-                      <wp:positionH relativeFrom="column">
-                        <wp:posOffset>2525751</wp:posOffset>
-                      </wp:positionH>
-                      <wp:positionV relativeFrom="paragraph">
-                        <wp:posOffset>1720850</wp:posOffset>
-                      </wp:positionV>
-                      <wp:extent cx="611505" cy="215900"/>
-                      <wp:effectExtent l="0" t="0" r="17145" b="12700"/>
-                      <wp:wrapNone/>
-                      <wp:docPr id="619711364" name="Rectangle 1"/>
-                      <wp:cNvGraphicFramePr/>
-                      <a:graphic xmlns:a="http://schemas.openxmlformats.org/drawingml/2006/main">
-                        <a:graphicData uri="http://schemas.microsoft.com/office/word/2010/wordprocessingShape">
-                          <wps:wsp>
-                            <wps:cNvSpPr/>
-                            <wps:spPr>
-                              <a:xfrm>
-                                <a:off x="0" y="0"/>
-                                <a:ext cx="611505" cy="215900"/>
-                              </a:xfrm>
-                              <a:prstGeom prst="rect">
-                                <a:avLst/>
-                              </a:prstGeom>
-                              <a:solidFill>
-                                <a:srgbClr val="000000">
-                                  <a:alpha val="60000"/>
-                                </a:srgbClr>
-                              </a:solidFill>
-                              <a:ln w="12700">
-                                <a:solidFill>
-                                  <a:srgbClr val="FF0000"/>
-                                </a:solidFill>
-                              </a:ln>
-                            </wps:spPr>
-                            <wps:style>
-                              <a:lnRef idx="2">
-                                <a:schemeClr val="accent1">
-                                  <a:shade val="15000"/>
-                                </a:schemeClr>
-                              </a:lnRef>
-                              <a:fillRef idx="1">
-                                <a:schemeClr val="accent1"/>
-                              </a:fillRef>
-                              <a:effectRef idx="0">
-                                <a:schemeClr val="accent1"/>
-                              </a:effectRef>
-                              <a:fontRef idx="minor">
-                                <a:schemeClr val="lt1"/>
-                              </a:fontRef>
-                            </wps:style>
-                            <wps:txbx>
-                              <w:txbxContent>
-                                <w:p>
-                                  <w:pPr>
-                                    <w:spacing w:after="0"/>
-                                    <w:jc w:val="center"/>
-                                    <w:rPr>
-                                      <w:b/>
-                                      <w:bCs/>
-                                      <w:color w:val="FF0000"/>
-                                      <w:sz w:val="20"/>
-                                      <w:szCs w:val="20"/>
-                                      <w:lang w:val="en-GB"/>
-                                      <w14:shadow w14:blurRad="50800" w14:dist="38100" w14:dir="2700000" w14:sx="100000" w14:sy="100000" w14:kx="0" w14:ky="0" w14:algn="tl">
-                                        <w14:srgbClr w14:val="000000">
-                                          <w14:alpha w14:val="60000"/>
-                                        </w14:srgbClr>
-                                      </w14:shadow>
-                                    </w:rPr>
-                                  </w:pPr>
-                                  <w:r>
-                                    <w:rPr>
-                                      <w:b/>
-                                      <w:bCs/>
-                                      <w:color w:val="FF0000"/>
-                                      <w:sz w:val="20"/>
-                                      <w:szCs w:val="20"/>
-                                      <w:lang w:val="en-GB"/>
-                                      <w14:shadow w14:blurRad="50800" w14:dist="38100" w14:dir="2700000" w14:sx="100000" w14:sy="100000" w14:kx="0" w14:ky="0" w14:algn="tl">
-                                        <w14:srgbClr w14:val="000000">
-                                          <w14:alpha w14:val="60000"/>
-                                        </w14:srgbClr>
-                                      </w14:shadow>
-                                    </w:rPr>
-                                    <w:t>Throttle</w:t>
-                                  </w:r>
-                                </w:p>
-                              </w:txbxContent>
-                            </wps:txbx>
-                            <wps:bodyPr rot="0" spcFirstLastPara="0" vertOverflow="overflow" horzOverflow="overflow" vert="horz" wrap="square" lIns="0" tIns="0" rIns="0" bIns="0" numCol="1" spcCol="0" rtlCol="0" fromWordArt="0" anchor="ctr" anchorCtr="0" forceAA="0" compatLnSpc="1">
-                              <a:prstTxWarp prst="textNoShape">
-                                <a:avLst/>
-                              </a:prstTxWarp>
-                              <a:noAutofit/>
-                            </wps:bodyPr>
-                          </wps:wsp>
-                        </a:graphicData>
-                      </a:graphic>
-                      <wp14:sizeRelH relativeFrom="margin">
-                        <wp14:pctWidth>0</wp14:pctWidth>
-                      </wp14:sizeRelH>
-                      <wp14:sizeRelV relativeFrom="margin">
-                        <wp14:pctHeight>0</wp14:pctHeight>
-                      </wp14:sizeRelV>
-                    </wp:anchor>
-                  </w:drawing>
-                </mc:Choice>
-                <mc:Fallback>
-                  <w:pict>
-                    <v:rect w14:anchorId="34F05FDF" id="_x0000_s1028" style="position:absolute;left:0;text-align:left;margin-left:198.9pt;margin-top:135.5pt;width:48.15pt;height:17pt;z-index:251770880;visibility:visible;mso-wrap-style:square;mso-width-percent:0;mso-height-percent:0;mso-wrap-distance-left:9pt;mso-wrap-distance-top:0;mso-wrap-distance-right:9pt;mso-wrap-distance-bottom:0;mso-position-horizontal:absolute;mso-position-horizontal-relative:text;mso-position-vertical:absolute;mso-position-vertical-relative:text;mso-width-percent:0;mso-height-percent:0;mso-width-relative:margin;mso-height-relative:margin;v-text-anchor:middle" o:gfxdata="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" fillcolor="black" strokecolor="red" strokeweight="1pt">
-                      <v:fill opacity="39321f"/>
-                      <v:textbox inset="0,0,0,0">
-                        <w:txbxContent>
-                          <w:p>
-                            <w:pPr>
-                              <w:spacing w:after="0"/>
-                              <w:jc w:val="center"/>
-                              <w:rPr>
-                                <w:b/>
-                                <w:bCs/>
-                                <w:color w:val="FF0000"/>
-                                <w:sz w:val="20"/>
-                                <w:szCs w:val="20"/>
-                                <w:lang w:val="en-GB"/>
-                                <w14:shadow w14:blurRad="50800" w14:dist="38100" w14:dir="2700000" w14:sx="100000" w14:sy="100000" w14:kx="0" w14:ky="0" w14:algn="tl">
-                                  <w14:srgbClr w14:val="000000">
-                                    <w14:alpha w14:val="60000"/>
-                                  </w14:srgbClr>
-                                </w14:shadow>
-                              </w:rPr>
-                            </w:pPr>
-                            <w:r>
-                              <w:rPr>
-                                <w:b/>
-                                <w:bCs/>
-                                <w:color w:val="FF0000"/>
-                                <w:sz w:val="20"/>
-                                <w:szCs w:val="20"/>
-                                <w:lang w:val="en-GB"/>
-                                <w14:shadow w14:blurRad="50800" w14:dist="38100" w14:dir="2700000" w14:sx="100000" w14:sy="100000" w14:kx="0" w14:ky="0" w14:algn="tl">
-                                  <w14:srgbClr w14:val="000000">
-                                    <w14:alpha w14:val="60000"/>
-                                  </w14:srgbClr>
-                                </w14:shadow>
-                              </w:rPr>
-                              <w:t>Throttle</w:t>
                             </w:r>
                           </w:p>
                         </w:txbxContent>
@@ -1472,7 +1523,7 @@
                 </mc:Choice>
                 <mc:Fallback>
                   <w:pict>
-                    <v:oval w14:anchorId="65304D15" id="Oval 1" o:spid="_x0000_s1026" style="position:absolute;margin-left:295.35pt;margin-top:360.55pt;width:7.5pt;height:7.5pt;z-index:251717632;visibility:visible;mso-wrap-style:square;mso-width-percent:0;mso-height-percent:0;mso-wrap-distance-left:9pt;mso-wrap-distance-top:0;mso-wrap-distance-right:9pt;mso-wrap-distance-bottom:0;mso-position-horizontal:absolute;mso-position-horizontal-relative:text;mso-position-vertical:absolute;mso-position-vertical-relative:text;mso-width-percent:0;mso-height-percent:0;mso-width-relative:margin;mso-height-relative:margin;v-text-anchor:middle" o:gfxdata="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" fillcolor="#00b050" strokecolor="white [3212]">
+                    <v:oval w14:anchorId="4E5A09C0" id="Oval 1" o:spid="_x0000_s1026" style="position:absolute;margin-left:295.35pt;margin-top:360.55pt;width:7.5pt;height:7.5pt;z-index:251717632;visibility:visible;mso-wrap-style:square;mso-width-percent:0;mso-height-percent:0;mso-wrap-distance-left:9pt;mso-wrap-distance-top:0;mso-wrap-distance-right:9pt;mso-wrap-distance-bottom:0;mso-position-horizontal:absolute;mso-position-horizontal-relative:text;mso-position-vertical:absolute;mso-position-vertical-relative:text;mso-width-percent:0;mso-height-percent:0;mso-width-relative:margin;mso-height-relative:margin;v-text-anchor:middle" o:gfxdata="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" fillcolor="#00b050" strokecolor="white [3212]">
                       <v:stroke joinstyle="miter"/>
                     </v:oval>
                   </w:pict>
@@ -1489,7 +1540,7 @@
               <mc:AlternateContent>
                 <mc:Choice Requires="wps">
                   <w:drawing>
-                    <wp:anchor distT="0" distB="0" distL="114300" distR="114300" simplePos="0" relativeHeight="251768832" behindDoc="0" locked="0" layoutInCell="1" allowOverlap="1" wp14:anchorId="245192CC" wp14:editId="2BE9C682">
+                    <wp:anchor distT="0" distB="0" distL="114300" distR="114300" simplePos="0" relativeHeight="251768832" behindDoc="0" locked="0" layoutInCell="1" allowOverlap="1" wp14:anchorId="245192CC" wp14:editId="3AAD2657">
                       <wp:simplePos x="0" y="0"/>
                       <wp:positionH relativeFrom="column">
                         <wp:posOffset>1598016</wp:posOffset>
@@ -1559,88 +1610,7 @@
                 </mc:Choice>
                 <mc:Fallback>
                   <w:pict>
-                    <v:oval w14:anchorId="16F0513E" id="Oval 1" o:spid="_x0000_s1026" style="position:absolute;margin-left:125.85pt;margin-top:348.25pt;width:7.5pt;height:7.5pt;z-index:251768832;visibility:visible;mso-wrap-style:square;mso-width-percent:0;mso-height-percent:0;mso-wrap-distance-left:9pt;mso-wrap-distance-top:0;mso-wrap-distance-right:9pt;mso-wrap-distance-bottom:0;mso-position-horizontal:absolute;mso-position-horizontal-relative:text;mso-position-vertical:absolute;mso-position-vertical-relative:text;mso-width-percent:0;mso-height-percent:0;mso-width-relative:margin;mso-height-relative:margin;v-text-anchor:middle" o:gfxdata="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" fillcolor="#00b050" strokecolor="white [3212]">
-                      <v:stroke joinstyle="miter"/>
-                    </v:oval>
-                  </w:pict>
-                </mc:Fallback>
-              </mc:AlternateContent>
-            </w:r>
-            <w:r>
-              <w:rPr>
-                <w:noProof/>
-                <w:color w:val="FFFFFF" w:themeColor="background1"/>
-                <w:sz w:val="32"/>
-                <w:szCs w:val="32"/>
-              </w:rPr>
-              <mc:AlternateContent>
-                <mc:Choice Requires="wps">
-                  <w:drawing>
-                    <wp:anchor distT="0" distB="0" distL="114300" distR="114300" simplePos="0" relativeHeight="251704320" behindDoc="0" locked="0" layoutInCell="1" allowOverlap="1" wp14:anchorId="3BA97E6A" wp14:editId="295C40C9">
-                      <wp:simplePos x="0" y="0"/>
-                      <wp:positionH relativeFrom="column">
-                        <wp:posOffset>2749474</wp:posOffset>
-                      </wp:positionH>
-                      <wp:positionV relativeFrom="paragraph">
-                        <wp:posOffset>709030</wp:posOffset>
-                      </wp:positionV>
-                      <wp:extent cx="95250" cy="95250"/>
-                      <wp:effectExtent l="0" t="0" r="19050" b="19050"/>
-                      <wp:wrapNone/>
-                      <wp:docPr id="1821372240" name="Oval 1"/>
-                      <wp:cNvGraphicFramePr/>
-                      <a:graphic xmlns:a="http://schemas.openxmlformats.org/drawingml/2006/main">
-                        <a:graphicData uri="http://schemas.microsoft.com/office/word/2010/wordprocessingShape">
-                          <wps:wsp>
-                            <wps:cNvSpPr/>
-                            <wps:spPr>
-                              <a:xfrm>
-                                <a:off x="0" y="0"/>
-                                <a:ext cx="95250" cy="95250"/>
-                              </a:xfrm>
-                              <a:prstGeom prst="ellipse">
-                                <a:avLst/>
-                              </a:prstGeom>
-                              <a:solidFill>
-                                <a:srgbClr val="00B050"/>
-                              </a:solidFill>
-                              <a:ln w="9525">
-                                <a:solidFill>
-                                  <a:schemeClr val="bg1"/>
-                                </a:solidFill>
-                              </a:ln>
-                            </wps:spPr>
-                            <wps:style>
-                              <a:lnRef idx="2">
-                                <a:schemeClr val="accent6">
-                                  <a:shade val="15000"/>
-                                </a:schemeClr>
-                              </a:lnRef>
-                              <a:fillRef idx="1">
-                                <a:schemeClr val="accent6"/>
-                              </a:fillRef>
-                              <a:effectRef idx="0">
-                                <a:schemeClr val="accent6"/>
-                              </a:effectRef>
-                              <a:fontRef idx="minor">
-                                <a:schemeClr val="lt1"/>
-                              </a:fontRef>
-                            </wps:style>
-                            <wps:bodyPr rot="0" spcFirstLastPara="0" vertOverflow="overflow" horzOverflow="overflow" vert="horz" wrap="square" lIns="91440" tIns="45720" rIns="91440" bIns="45720" numCol="1" spcCol="0" rtlCol="0" fromWordArt="0" anchor="ctr" anchorCtr="0" forceAA="0" compatLnSpc="1">
-                              <a:prstTxWarp prst="textNoShape">
-                                <a:avLst/>
-                              </a:prstTxWarp>
-                              <a:noAutofit/>
-                            </wps:bodyPr>
-                          </wps:wsp>
-                        </a:graphicData>
-                      </a:graphic>
-                    </wp:anchor>
-                  </w:drawing>
-                </mc:Choice>
-                <mc:Fallback>
-                  <w:pict>
-                    <v:oval w14:anchorId="7A1D62C1" id="Oval 1" o:spid="_x0000_s1026" style="position:absolute;margin-left:216.5pt;margin-top:55.85pt;width:7.5pt;height:7.5pt;z-index:251704320;visibility:visible;mso-wrap-style:square;mso-wrap-distance-left:9pt;mso-wrap-distance-top:0;mso-wrap-distance-right:9pt;mso-wrap-distance-bottom:0;mso-position-horizontal:absolute;mso-position-horizontal-relative:text;mso-position-vertical:absolute;mso-position-vertical-relative:text;v-text-anchor:middle" o:gfxdata="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" fillcolor="#00b050" strokecolor="white [3212]">
+                    <v:oval w14:anchorId="54A4104F" id="Oval 1" o:spid="_x0000_s1026" style="position:absolute;margin-left:125.85pt;margin-top:348.25pt;width:7.5pt;height:7.5pt;z-index:251768832;visibility:visible;mso-wrap-style:square;mso-width-percent:0;mso-height-percent:0;mso-wrap-distance-left:9pt;mso-wrap-distance-top:0;mso-wrap-distance-right:9pt;mso-wrap-distance-bottom:0;mso-position-horizontal:absolute;mso-position-horizontal-relative:text;mso-position-vertical:absolute;mso-position-vertical-relative:text;mso-width-percent:0;mso-height-percent:0;mso-width-relative:margin;mso-height-relative:margin;v-text-anchor:middle" o:gfxdata="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" fillcolor="#00b050" strokecolor="white [3212]">
                       <v:stroke joinstyle="miter"/>
                     </v:oval>
                   </w:pict>
@@ -7257,13 +7227,13 @@
         <w:tblLook w:val="04A0" w:firstRow="1" w:lastRow="0" w:firstColumn="1" w:lastColumn="0" w:noHBand="0" w:noVBand="1"/>
       </w:tblPr>
       <w:tblGrid>
-        <w:gridCol w:w="8642"/>
-        <w:gridCol w:w="1814"/>
+        <w:gridCol w:w="9356"/>
+        <w:gridCol w:w="1110"/>
       </w:tblGrid>
       <w:tr>
         <w:tc>
           <w:tcPr>
-            <w:tcW w:w="8642" w:type="dxa"/>
+            <w:tcW w:w="9356" w:type="dxa"/>
           </w:tcPr>
           <w:p>
             <w:pPr>
@@ -7291,7 +7261,7 @@
                 <w:sz w:val="14"/>
                 <w:szCs w:val="14"/>
               </w:rPr>
-              <w:t xml:space="preserve"> For </w:t>
+              <w:t xml:space="preserve"> </w:t>
             </w:r>
             <w:hyperlink r:id="rId15" w:history="1">
               <w:r>
@@ -7301,14 +7271,14 @@
                   <w:sz w:val="14"/>
                   <w:szCs w:val="14"/>
                 </w:rPr>
-                <w:t>https://store.steampowered.com/app/3879950/Train_Sim_World_6_Southern_BR_Class_171__BR_Class_3773_AddOn/</w:t>
+                <w:t>https://store.steampowered.com/app/3662330/Train_Sim_World_6_East_Coastway_Remastered_Brighton__Eastbourne__Seaford_Route_AddOn/</w:t>
               </w:r>
             </w:hyperlink>
           </w:p>
         </w:tc>
         <w:tc>
           <w:tcPr>
-            <w:tcW w:w="1814" w:type="dxa"/>
+            <w:tcW w:w="1110" w:type="dxa"/>
           </w:tcPr>
           <w:p>
             <w:pPr>

</xml_diff>